<commit_message>
Aggiunge dicitura GDPR standard a template e CV generati
Sezione "Data Protection" con autorizzazione al trattamento dei dati
personali (GDPR 2016/679 / D.Lgs. 196/2003), aggiunta al template
master e a tutti i CV già generati (EY-Parthenon, Sky Italia, Roland
Berger, Avolta); rigenerato anche il .docx di Avolta.
</commit_message>
<xml_diff>
--- a/cv/generated/avolta-global-principal-data-analyst-milano/cv.docx
+++ b/cv/generated/avolta-global-principal-data-analyst-milano/cv.docx
@@ -851,6 +851,39 @@
           <w:szCs w:val="20"/>
         </w:rPr>
         <w:t xml:space="preserve">Italian (native) · English (fluent) · Spanish (basic)</w:t>
+      </w:r>
+    </w:p>
+    <w:p>
+      <w:pPr>
+        <w:pBdr>
+          <w:bottom w:val="single" w:color="1F2A44" w:sz="6" w:space="4"/>
+        </w:pBdr>
+        <w:spacing w:after="120" w:before="280"/>
+      </w:pPr>
+      <w:r>
+        <w:rPr>
+          <w:rFonts w:ascii="Calibri" w:cs="Calibri" w:eastAsia="Calibri" w:hAnsi="Calibri"/>
+          <w:b/>
+          <w:bCs/>
+          <w:color w:val="1F2A44"/>
+          <w:spacing w:val="20"/>
+          <w:sz w:val="20"/>
+          <w:szCs w:val="20"/>
+        </w:rPr>
+        <w:t xml:space="preserve">DATA PROTECTION</w:t>
+      </w:r>
+    </w:p>
+    <w:p>
+      <w:r>
+        <w:rPr>
+          <w:rFonts w:ascii="Calibri" w:cs="Calibri" w:eastAsia="Calibri" w:hAnsi="Calibri"/>
+          <w:i/>
+          <w:iCs/>
+          <w:color w:val="5B6470"/>
+          <w:sz w:val="18"/>
+          <w:szCs w:val="18"/>
+        </w:rPr>
+        <w:t xml:space="preserve">I authorize the processing of my personal data contained in this CV pursuant to the EU General Data Protection Regulation (GDPR) 2016/679 and, where applicable, Italian Legislative Decree 196/2003.</w:t>
       </w:r>
     </w:p>
     <w:sectPr>

</xml_diff>

<commit_message>
Genera CV per Amplifon e ripristina la sezione Social & Cultural Commitment
Fase 5: CV generato per Amplifon (Global Customer Intelligence & CRM
Insights) su richiesta esplicita dell'utente, nonostante l'incertezza
economica e il possibile disallineamento di seniority già segnalati.

Aggiunge inoltre la sezione "Social & Cultural Commitment" (da
profile.yaml -> volunteering_and_extracurricular) al template master e
a tutti i CV generati: era presente nel CV originale dell'utente ma
era stata omessa o inclusa solo parzialmente nei CV già generati.

Aggiunge anche l'esportazione .docx per Amplifon e rigenera quella di
Avolta con la sezione completa.
</commit_message>
<xml_diff>
--- a/cv/generated/avolta-global-principal-data-analyst-milano/cv.docx
+++ b/cv/generated/avolta-global-principal-data-analyst-milano/cv.docx
@@ -104,7 +104,7 @@
     </w:p>
     <w:p>
       <w:pPr>
-        <w:spacing w:after="100"/>
+        <w:spacing w:after="80"/>
       </w:pPr>
       <w:r>
         <w:rPr>
@@ -149,16 +149,7 @@
           <w:sz w:val="22"/>
           <w:szCs w:val="22"/>
         </w:rPr>
-        <w:t xml:space="preserve">Marketing Data Analyst</w:t>
-      </w:r>
-      <w:r>
-        <w:rPr>
-          <w:rFonts w:ascii="Calibri" w:cs="Calibri" w:eastAsia="Calibri" w:hAnsi="Calibri"/>
-          <w:color w:val="111318"/>
-          <w:sz w:val="22"/>
-          <w:szCs w:val="22"/>
-        </w:rPr>
-        <w:t xml:space="preserve">  —  Gruppo Mediaset – Publitalia '80</w:t>
+        <w:t xml:space="preserve">Marketing Data Analyst  —  Gruppo Mediaset – Publitalia '80</w:t>
       </w:r>
     </w:p>
     <w:p>
@@ -342,16 +333,7 @@
           <w:sz w:val="22"/>
           <w:szCs w:val="22"/>
         </w:rPr>
-        <w:t xml:space="preserve">Analytics Consultant</w:t>
-      </w:r>
-      <w:r>
-        <w:rPr>
-          <w:rFonts w:ascii="Calibri" w:cs="Calibri" w:eastAsia="Calibri" w:hAnsi="Calibri"/>
-          <w:color w:val="111318"/>
-          <w:sz w:val="22"/>
-          <w:szCs w:val="22"/>
-        </w:rPr>
-        <w:t xml:space="preserve">  —  Jakala SpA</w:t>
+        <w:t xml:space="preserve">Analytics Consultant  —  Jakala SpA</w:t>
       </w:r>
     </w:p>
     <w:p>
@@ -535,16 +517,7 @@
           <w:sz w:val="22"/>
           <w:szCs w:val="22"/>
         </w:rPr>
-        <w:t xml:space="preserve">Junior Data Analyst</w:t>
-      </w:r>
-      <w:r>
-        <w:rPr>
-          <w:rFonts w:ascii="Calibri" w:cs="Calibri" w:eastAsia="Calibri" w:hAnsi="Calibri"/>
-          <w:color w:val="111318"/>
-          <w:sz w:val="22"/>
-          <w:szCs w:val="22"/>
-        </w:rPr>
-        <w:t xml:space="preserve">  —  A.G.S. SpA</w:t>
+        <w:t xml:space="preserve">Junior Data Analyst  —  A.G.S. SpA</w:t>
       </w:r>
     </w:p>
     <w:p>
@@ -675,76 +648,28 @@
           <w:sz w:val="20"/>
           <w:szCs w:val="20"/>
         </w:rPr>
-        <w:t xml:space="preserve">SKILLS</w:t>
+        <w:t xml:space="preserve">SOCIAL &amp; CULTURAL COMMITMENT</w:t>
+      </w:r>
+    </w:p>
+    <w:p>
+      <w:pPr>
+        <w:spacing w:after="20" w:before="160"/>
+      </w:pPr>
+      <w:r>
+        <w:rPr>
+          <w:rFonts w:ascii="Calibri" w:cs="Calibri" w:eastAsia="Calibri" w:hAnsi="Calibri"/>
+          <w:b/>
+          <w:bCs/>
+          <w:color w:val="111318"/>
+          <w:sz w:val="22"/>
+          <w:szCs w:val="22"/>
+        </w:rPr>
+        <w:t xml:space="preserve">Students' Tutor  —  Camplus</w:t>
       </w:r>
     </w:p>
     <w:p>
       <w:pPr>
         <w:spacing w:after="80"/>
-      </w:pPr>
-      <w:r>
-        <w:rPr>
-          <w:rFonts w:ascii="Calibri" w:cs="Calibri" w:eastAsia="Calibri" w:hAnsi="Calibri"/>
-          <w:color w:val="1c1d1b"/>
-          <w:sz w:val="20"/>
-          <w:szCs w:val="20"/>
-        </w:rPr>
-        <w:t xml:space="preserve">SQL · Python · PySpark · KPI Frameworks · Forecasting Models · Business Analytics · AWS (Athena, Glue) · Snowflake · Google BigQuery · Power BI · Qlik · Data Visualization · Statistical Modeling · Machine Learning · Customer Behavior Analysis · Audience &amp; Media Analytics · ETL &amp; Data Pipelines</w:t>
-      </w:r>
-    </w:p>
-    <w:p>
-      <w:pPr>
-        <w:spacing w:after="40"/>
-      </w:pPr>
-      <w:r>
-        <w:rPr>
-          <w:rFonts w:ascii="Calibri" w:cs="Calibri" w:eastAsia="Calibri" w:hAnsi="Calibri"/>
-          <w:color w:val="1c1d1b"/>
-          <w:sz w:val="20"/>
-          <w:szCs w:val="20"/>
-        </w:rPr>
-        <w:t xml:space="preserve">Analytical skills · Problem solving · Stakeholder communication · Cross-functional collaboration</w:t>
-      </w:r>
-    </w:p>
-    <w:p>
-      <w:pPr>
-        <w:pBdr>
-          <w:bottom w:val="single" w:color="1F2A44" w:sz="6" w:space="4"/>
-        </w:pBdr>
-        <w:spacing w:after="120" w:before="280"/>
-      </w:pPr>
-      <w:r>
-        <w:rPr>
-          <w:rFonts w:ascii="Calibri" w:cs="Calibri" w:eastAsia="Calibri" w:hAnsi="Calibri"/>
-          <w:b/>
-          <w:bCs/>
-          <w:color w:val="1F2A44"/>
-          <w:spacing w:val="20"/>
-          <w:sz w:val="20"/>
-          <w:szCs w:val="20"/>
-        </w:rPr>
-        <w:t xml:space="preserve">EDUCATION</w:t>
-      </w:r>
-    </w:p>
-    <w:p>
-      <w:pPr>
-        <w:spacing w:after="10"/>
-      </w:pPr>
-      <w:r>
-        <w:rPr>
-          <w:rFonts w:ascii="Calibri" w:cs="Calibri" w:eastAsia="Calibri" w:hAnsi="Calibri"/>
-          <w:b/>
-          <w:bCs/>
-          <w:color w:val="111318"/>
-          <w:sz w:val="20"/>
-          <w:szCs w:val="20"/>
-        </w:rPr>
-        <w:t xml:space="preserve">M.Sc. in Economics — Università Cattolica del Sacro Cuore</w:t>
-      </w:r>
-    </w:p>
-    <w:p>
-      <w:pPr>
-        <w:spacing w:after="100"/>
       </w:pPr>
       <w:r>
         <w:rPr>
@@ -755,12 +680,31 @@
           <w:sz w:val="19"/>
           <w:szCs w:val="19"/>
         </w:rPr>
-        <w:t xml:space="preserve">Milan · 2018 – 2021-07</w:t>
-      </w:r>
-    </w:p>
-    <w:p>
-      <w:pPr>
-        <w:spacing w:after="10"/>
+        <w:t xml:space="preserve">Milan · 2018 – 2020</w:t>
+      </w:r>
+    </w:p>
+    <w:p>
+      <w:pPr>
+        <w:pStyle w:val="ListParagraph"/>
+        <w:numPr>
+          <w:ilvl w:val="0"/>
+          <w:numId w:val="2"/>
+        </w:numPr>
+        <w:spacing w:after="40"/>
+      </w:pPr>
+      <w:r>
+        <w:rPr>
+          <w:rFonts w:ascii="Calibri" w:cs="Calibri" w:eastAsia="Calibri" w:hAnsi="Calibri"/>
+          <w:color w:val="1c1d1b"/>
+          <w:sz w:val="20"/>
+          <w:szCs w:val="20"/>
+        </w:rPr>
+        <w:t xml:space="preserve">Tutoring university students for the preparation of microeconomics and business economics exams</w:t>
+      </w:r>
+    </w:p>
+    <w:p>
+      <w:pPr>
+        <w:spacing w:after="20" w:before="160"/>
       </w:pPr>
       <w:r>
         <w:rPr>
@@ -768,15 +712,15 @@
           <w:b/>
           <w:bCs/>
           <w:color w:val="111318"/>
-          <w:sz w:val="20"/>
-          <w:szCs w:val="20"/>
-        </w:rPr>
-        <w:t xml:space="preserve">B.A. in Economics, Finance and Global Markets — Università Cattolica del Sacro Cuore</w:t>
-      </w:r>
-    </w:p>
-    <w:p>
-      <w:pPr>
-        <w:spacing w:after="100"/>
+          <w:sz w:val="22"/>
+          <w:szCs w:val="22"/>
+        </w:rPr>
+        <w:t xml:space="preserve">Study Assistance to Middle School Pupils  —  Cooperativa Martinengo</w:t>
+      </w:r>
+    </w:p>
+    <w:p>
+      <w:pPr>
+        <w:spacing w:after="80"/>
       </w:pPr>
       <w:r>
         <w:rPr>
@@ -787,12 +731,12 @@
           <w:sz w:val="19"/>
           <w:szCs w:val="19"/>
         </w:rPr>
-        <w:t xml:space="preserve">Milan · 2015 – 2018</w:t>
-      </w:r>
-    </w:p>
-    <w:p>
-      <w:pPr>
-        <w:spacing w:after="10"/>
+        <w:t xml:space="preserve">Milan · 2018 – 2021-07</w:t>
+      </w:r>
+    </w:p>
+    <w:p>
+      <w:pPr>
+        <w:spacing w:after="20" w:before="160"/>
       </w:pPr>
       <w:r>
         <w:rPr>
@@ -800,15 +744,15 @@
           <w:b/>
           <w:bCs/>
           <w:color w:val="111318"/>
-          <w:sz w:val="20"/>
-          <w:szCs w:val="20"/>
-        </w:rPr>
-        <w:t xml:space="preserve">High School Diploma — Liceo Classico Statale Carlo Alberto</w:t>
-      </w:r>
-    </w:p>
-    <w:p>
-      <w:pPr>
-        <w:spacing w:after="100"/>
+          <w:sz w:val="22"/>
+          <w:szCs w:val="22"/>
+        </w:rPr>
+        <w:t xml:space="preserve">Study Assistance to High School Students  —  Portofranco</w:t>
+      </w:r>
+    </w:p>
+    <w:p>
+      <w:pPr>
+        <w:spacing w:after="80"/>
       </w:pPr>
       <w:r>
         <w:rPr>
@@ -819,7 +763,39 @@
           <w:sz w:val="19"/>
           <w:szCs w:val="19"/>
         </w:rPr>
-        <w:t xml:space="preserve">Novara · 2010 – 2015</w:t>
+        <w:t xml:space="preserve">Milan · 2015</w:t>
+      </w:r>
+    </w:p>
+    <w:p>
+      <w:pPr>
+        <w:spacing w:after="20" w:before="160"/>
+      </w:pPr>
+      <w:r>
+        <w:rPr>
+          <w:rFonts w:ascii="Calibri" w:cs="Calibri" w:eastAsia="Calibri" w:hAnsi="Calibri"/>
+          <w:b/>
+          <w:bCs/>
+          <w:color w:val="111318"/>
+          <w:sz w:val="22"/>
+          <w:szCs w:val="22"/>
+        </w:rPr>
+        <w:t xml:space="preserve">Background Actor, La Bohème and Turandot  —  Coro Langhi, Compagnia Teatro Coccia</w:t>
+      </w:r>
+    </w:p>
+    <w:p>
+      <w:pPr>
+        <w:spacing w:after="80"/>
+      </w:pPr>
+      <w:r>
+        <w:rPr>
+          <w:rFonts w:ascii="Calibri" w:cs="Calibri" w:eastAsia="Calibri" w:hAnsi="Calibri"/>
+          <w:i/>
+          <w:iCs/>
+          <w:color w:val="5B6470"/>
+          <w:sz w:val="19"/>
+          <w:szCs w:val="19"/>
+        </w:rPr>
+        <w:t xml:space="preserve">Novara · 2009 – 2010</w:t>
       </w:r>
     </w:p>
     <w:p>
@@ -839,10 +815,177 @@
           <w:sz w:val="20"/>
           <w:szCs w:val="20"/>
         </w:rPr>
+        <w:t xml:space="preserve">SKILLS</w:t>
+      </w:r>
+    </w:p>
+    <w:p>
+      <w:pPr>
+        <w:spacing w:after="80"/>
+      </w:pPr>
+      <w:r>
+        <w:rPr>
+          <w:rFonts w:ascii="Calibri" w:cs="Calibri" w:eastAsia="Calibri" w:hAnsi="Calibri"/>
+          <w:color w:val="1c1d1b"/>
+          <w:sz w:val="20"/>
+          <w:szCs w:val="20"/>
+        </w:rPr>
+        <w:t xml:space="preserve">SQL · Python · PySpark · KPI Frameworks · Forecasting Models · Business Analytics · AWS (Athena, Glue) · Snowflake · Google BigQuery · Power BI · Qlik · Data Visualization · Statistical Modeling · Machine Learning · Customer Behavior Analysis · Audience &amp; Media Analytics · ETL &amp; Data Pipelines</w:t>
+      </w:r>
+    </w:p>
+    <w:p>
+      <w:pPr>
+        <w:spacing w:after="80"/>
+      </w:pPr>
+      <w:r>
+        <w:rPr>
+          <w:rFonts w:ascii="Calibri" w:cs="Calibri" w:eastAsia="Calibri" w:hAnsi="Calibri"/>
+          <w:color w:val="1c1d1b"/>
+          <w:sz w:val="20"/>
+          <w:szCs w:val="20"/>
+        </w:rPr>
+        <w:t xml:space="preserve">Analytical skills · Problem solving · Stakeholder communication · Cross-functional collaboration</w:t>
+      </w:r>
+    </w:p>
+    <w:p>
+      <w:pPr>
+        <w:pBdr>
+          <w:bottom w:val="single" w:color="1F2A44" w:sz="6" w:space="4"/>
+        </w:pBdr>
+        <w:spacing w:after="120" w:before="280"/>
+      </w:pPr>
+      <w:r>
+        <w:rPr>
+          <w:rFonts w:ascii="Calibri" w:cs="Calibri" w:eastAsia="Calibri" w:hAnsi="Calibri"/>
+          <w:b/>
+          <w:bCs/>
+          <w:color w:val="1F2A44"/>
+          <w:spacing w:val="20"/>
+          <w:sz w:val="20"/>
+          <w:szCs w:val="20"/>
+        </w:rPr>
+        <w:t xml:space="preserve">EDUCATION</w:t>
+      </w:r>
+    </w:p>
+    <w:p>
+      <w:pPr>
+        <w:spacing w:after="10"/>
+      </w:pPr>
+      <w:r>
+        <w:rPr>
+          <w:rFonts w:ascii="Calibri" w:cs="Calibri" w:eastAsia="Calibri" w:hAnsi="Calibri"/>
+          <w:b/>
+          <w:bCs/>
+          <w:color w:val="111318"/>
+          <w:sz w:val="20"/>
+          <w:szCs w:val="20"/>
+        </w:rPr>
+        <w:t xml:space="preserve">M.Sc. in Economics — Università Cattolica del Sacro Cuore</w:t>
+      </w:r>
+    </w:p>
+    <w:p>
+      <w:pPr>
+        <w:spacing w:after="100"/>
+      </w:pPr>
+      <w:r>
+        <w:rPr>
+          <w:rFonts w:ascii="Calibri" w:cs="Calibri" w:eastAsia="Calibri" w:hAnsi="Calibri"/>
+          <w:i/>
+          <w:iCs/>
+          <w:color w:val="5B6470"/>
+          <w:sz w:val="19"/>
+          <w:szCs w:val="19"/>
+        </w:rPr>
+        <w:t xml:space="preserve">Milan · 2018 – 2021-07</w:t>
+      </w:r>
+    </w:p>
+    <w:p>
+      <w:pPr>
+        <w:spacing w:after="10"/>
+      </w:pPr>
+      <w:r>
+        <w:rPr>
+          <w:rFonts w:ascii="Calibri" w:cs="Calibri" w:eastAsia="Calibri" w:hAnsi="Calibri"/>
+          <w:b/>
+          <w:bCs/>
+          <w:color w:val="111318"/>
+          <w:sz w:val="20"/>
+          <w:szCs w:val="20"/>
+        </w:rPr>
+        <w:t xml:space="preserve">B.A. in Economics, Finance and Global Markets — Università Cattolica del Sacro Cuore</w:t>
+      </w:r>
+    </w:p>
+    <w:p>
+      <w:pPr>
+        <w:spacing w:after="100"/>
+      </w:pPr>
+      <w:r>
+        <w:rPr>
+          <w:rFonts w:ascii="Calibri" w:cs="Calibri" w:eastAsia="Calibri" w:hAnsi="Calibri"/>
+          <w:i/>
+          <w:iCs/>
+          <w:color w:val="5B6470"/>
+          <w:sz w:val="19"/>
+          <w:szCs w:val="19"/>
+        </w:rPr>
+        <w:t xml:space="preserve">Milan · 2015 – 2018</w:t>
+      </w:r>
+    </w:p>
+    <w:p>
+      <w:pPr>
+        <w:spacing w:after="10"/>
+      </w:pPr>
+      <w:r>
+        <w:rPr>
+          <w:rFonts w:ascii="Calibri" w:cs="Calibri" w:eastAsia="Calibri" w:hAnsi="Calibri"/>
+          <w:b/>
+          <w:bCs/>
+          <w:color w:val="111318"/>
+          <w:sz w:val="20"/>
+          <w:szCs w:val="20"/>
+        </w:rPr>
+        <w:t xml:space="preserve">High School Diploma — Liceo Classico Statale Carlo Alberto</w:t>
+      </w:r>
+    </w:p>
+    <w:p>
+      <w:pPr>
+        <w:spacing w:after="100"/>
+      </w:pPr>
+      <w:r>
+        <w:rPr>
+          <w:rFonts w:ascii="Calibri" w:cs="Calibri" w:eastAsia="Calibri" w:hAnsi="Calibri"/>
+          <w:i/>
+          <w:iCs/>
+          <w:color w:val="5B6470"/>
+          <w:sz w:val="19"/>
+          <w:szCs w:val="19"/>
+        </w:rPr>
+        <w:t xml:space="preserve">Novara · 2010 – 2015</w:t>
+      </w:r>
+    </w:p>
+    <w:p>
+      <w:pPr>
+        <w:pBdr>
+          <w:bottom w:val="single" w:color="1F2A44" w:sz="6" w:space="4"/>
+        </w:pBdr>
+        <w:spacing w:after="120" w:before="280"/>
+      </w:pPr>
+      <w:r>
+        <w:rPr>
+          <w:rFonts w:ascii="Calibri" w:cs="Calibri" w:eastAsia="Calibri" w:hAnsi="Calibri"/>
+          <w:b/>
+          <w:bCs/>
+          <w:color w:val="1F2A44"/>
+          <w:spacing w:val="20"/>
+          <w:sz w:val="20"/>
+          <w:szCs w:val="20"/>
+        </w:rPr>
         <w:t xml:space="preserve">LANGUAGES</w:t>
       </w:r>
     </w:p>
     <w:p>
+      <w:pPr>
+        <w:spacing w:after="80"/>
+      </w:pPr>
       <w:r>
         <w:rPr>
           <w:rFonts w:ascii="Calibri" w:cs="Calibri" w:eastAsia="Calibri" w:hAnsi="Calibri"/>

</xml_diff>